<commit_message>
Correct order-book data: Coincall is L2-only (no L3); remove old GLFT files
- Fix the Week 2 microstructure material (syllabus + Week 2 deck) to state
  that Coincall provides L2 aggregated depth only -- there is no L3 /
  per-order feed -- so the program models aggregate intensity rather than
  individual queue position.
- Remove the original glft_options_mm_*.{docx,pdf} from the working tree to
  avoid confusion (still in git history).
- Regenerated syllabus and Week 2 deck; ignore Beamer .nav/.snm.

Co-Authored-By: Claude Opus 4.8 (1M context) <noreply@anthropic.com>
</commit_message>
<xml_diff>
--- a/syllabus.docx
+++ b/syllabus.docx
@@ -2062,19 +2062,31 @@
         <w:t xml:space="preserve"> </w:t>
       </w:r>
       <w:r>
-        <w:t xml:space="preserve">L1/L2/L3 order-book views; tick size and lot size; and the Coincall</w:t>
-      </w:r>
-      <w:r>
-        <w:t xml:space="preserve"> </w:t>
-      </w:r>
-      <w:r>
-        <w:t xml:space="preserve">exchange architecture (contract specifications, fee structure, market</w:t>
-      </w:r>
-      <w:r>
-        <w:t xml:space="preserve"> </w:t>
-      </w:r>
-      <w:r>
-        <w:t xml:space="preserve">maker tiers).</w:t>
+        <w:t xml:space="preserve">L1 and L2 order-book views (Coincall provides L2 aggregated depth; there</w:t>
+      </w:r>
+      <w:r>
+        <w:t xml:space="preserve"> </w:t>
+      </w:r>
+      <w:r>
+        <w:t xml:space="preserve">is no L3 / per-order feed, so the program models aggregate intensity</w:t>
+      </w:r>
+      <w:r>
+        <w:t xml:space="preserve"> </w:t>
+      </w:r>
+      <w:r>
+        <w:t xml:space="preserve">rather than individual queue position); tick size and lot size; and the</w:t>
+      </w:r>
+      <w:r>
+        <w:t xml:space="preserve"> </w:t>
+      </w:r>
+      <w:r>
+        <w:t xml:space="preserve">Coincall exchange architecture (contract specifications, fee structure,</w:t>
+      </w:r>
+      <w:r>
+        <w:t xml:space="preserve"> </w:t>
+      </w:r>
+      <w:r>
+        <w:t xml:space="preserve">market maker tiers).</w:t>
       </w:r>
     </w:p>
     <w:p>

</xml_diff>